<commit_message>
Replaced EC2 with finding the perimeter of a continent of obstacles.
</commit_message>
<xml_diff>
--- a/Lab 5 - Iteration.docx
+++ b/Lab 5 - Iteration.docx
@@ -612,6 +612,7 @@
         <w:rPr>
           <w:u w:val="single"/>
         </w:rPr>
+        <w:lastRenderedPageBreak/>
         <w:t>Get your robot moving around</w:t>
       </w:r>
       <w:r>
@@ -1268,6 +1269,7 @@
         <w:br w:type="page"/>
       </w:r>
       <w:r>
+        <w:lastRenderedPageBreak/>
         <w:t xml:space="preserve">Part </w:t>
       </w:r>
       <w:r>
@@ -1660,6 +1662,7 @@
         <w:pStyle w:val="NormalWeb"/>
       </w:pPr>
       <w:r>
+        <w:lastRenderedPageBreak/>
         <w:t xml:space="preserve">Over the next </w:t>
       </w:r>
       <w:r>
@@ -2095,6 +2098,7 @@
         <w:pStyle w:val="NormalWeb"/>
       </w:pPr>
       <w:r>
+        <w:lastRenderedPageBreak/>
         <w:t>Finally</w:t>
       </w:r>
       <w:r>
@@ -2374,67 +2378,54 @@
         </w:tabs>
       </w:pPr>
       <w:r>
-        <w:t>Option 2: Spiral Pattern</w:t>
-      </w:r>
-    </w:p>
-    <w:p>
-      <w:pPr>
-        <w:pStyle w:val="NormalWeb"/>
-      </w:pPr>
-      <w:r>
-        <w:t xml:space="preserve">This time, your robot should: </w:t>
-      </w:r>
-    </w:p>
-    <w:p>
-      <w:pPr>
-        <w:pStyle w:val="NormalWeb"/>
-        <w:numPr>
-          <w:ilvl w:val="0"/>
-          <w:numId w:val="2"/>
-        </w:numPr>
-      </w:pPr>
-      <w:r>
-        <w:t>visit every grid cell in the whole room</w:t>
-      </w:r>
-    </w:p>
-    <w:p>
-      <w:pPr>
-        <w:pStyle w:val="NormalWeb"/>
-        <w:numPr>
-          <w:ilvl w:val="0"/>
-          <w:numId w:val="2"/>
-        </w:numPr>
-      </w:pPr>
-      <w:r>
-        <w:t>without visiting the same cell twice</w:t>
-      </w:r>
-    </w:p>
-    <w:p>
-      <w:pPr>
-        <w:pStyle w:val="NormalWeb"/>
-        <w:numPr>
-          <w:ilvl w:val="0"/>
-          <w:numId w:val="2"/>
-        </w:numPr>
-      </w:pPr>
-      <w:r>
-        <w:t xml:space="preserve">move outwards from its starting position and orientation in a spiral pattern. </w:t>
-      </w:r>
-    </w:p>
-    <w:p>
-      <w:pPr>
-        <w:pStyle w:val="NormalWeb"/>
-      </w:pPr>
-      <w:r>
-        <w:t xml:space="preserve">You can still get some points for this if your spiral pattern doesn’t visit every grid cell or sometimes visits the same cell twice – see what you can </w:t>
-      </w:r>
-      <w:proofErr w:type="gramStart"/>
-      <w:r>
-        <w:t>do, and</w:t>
-      </w:r>
-      <w:proofErr w:type="gramEnd"/>
-      <w:r>
-        <w:t xml:space="preserve"> ask around for ideas! </w:t>
+        <w:t xml:space="preserve">Option 2: </w:t>
+      </w:r>
+      <w:r>
+        <w:t>Measure “Shoreline” of Obstacle “Continent”</w:t>
+      </w:r>
+    </w:p>
+    <w:p>
+      <w:pPr>
+        <w:pStyle w:val="NormalWeb"/>
+      </w:pPr>
+      <w:r>
+        <w:lastRenderedPageBreak/>
+        <w:t xml:space="preserve">Create a “continent” of obstacles by clicking in the grid – i.e., multiple obstacles that are all connected, and not touching any walls. </w:t>
+      </w:r>
+    </w:p>
+    <w:p>
+      <w:pPr>
+        <w:pStyle w:val="NormalWeb"/>
+      </w:pPr>
+      <w:r>
+        <w:t xml:space="preserve">Manually drive your robot so it is touching part of the continent and facing an obstacle. </w:t>
+      </w:r>
+    </w:p>
+    <w:p>
+      <w:pPr>
+        <w:pStyle w:val="NormalWeb"/>
+      </w:pPr>
+      <w:r>
+        <w:t xml:space="preserve">Write code so that, when you press Go, the robot will (1) feel its way around the obstacle continent, (2) stop when it returns to its original position, and (3) report how many steps it took (not including turns), which should be the length of the continent’s perimeter. </w:t>
+      </w:r>
+    </w:p>
+    <w:p>
+      <w:pPr>
+        <w:pStyle w:val="NormalWeb"/>
+      </w:pPr>
+      <w:r>
+        <w:t>This should work for continents that have a concave section (e.g., a continent shaped like a “C”).</w:t>
+      </w:r>
+    </w:p>
+    <w:p>
+      <w:pPr>
+        <w:pStyle w:val="NormalWeb"/>
+      </w:pPr>
+      <w:r>
+        <w:t xml:space="preserve">You might want to start with just a single obstacle as your continent and work up from there. </w:t>
+      </w:r>
+      <w:r>
+        <w:t xml:space="preserve"> </w:t>
       </w:r>
     </w:p>
     <w:p>

</xml_diff>